<commit_message>
docs(consolidate): single client explanation
- HOW_IT_WORKS.pdf/docx now includes Installation (ch 11) and
  Walkthrough (ch 12) chapters, folding in INSTALL.md and
  ui_walkthrough.md content. 14-section, 29-page document.
- README.md rewritten to <100 lines: quick start, results table,
  architecture, project structure, docs table, references.
- ENDGOAL.md checklist moved to docs/endgoal_checklist.md.
- Standalone INSTALL.md, PROMPT.md, docs/ui_walkthrough.md deleted
  (content consolidated into HOW_IT_WORKS or no longer needed).

Co-Authored-By: Claude Opus 4.6 <noreply@anthropic.com>
</commit_message>
<xml_diff>
--- a/docs/HOW_IT_WORKS.docx
+++ b/docs/HOW_IT_WORKS.docx
@@ -1732,7 +1732,97 @@
         <w:pStyle w:val="Heading1"/>
       </w:pPr>
       <w:r>
-        <w:t>11. Glossary</w:t>
+        <w:t>11. Installation</w:t>
+      </w:r>
+    </w:p>
+    <w:p>
+      <w:r>
+        <w:t>Quick start: git clone, pip install -r requirements.txt, python run.py --fetch-models &lt;URL&gt;, python app.py. The --fetch-models command downloads ~105 MB of trained models and verifies SHA-256 checksums. Log in with admin / admin. See the PDF for full installation details and troubleshooting.</w:t>
+      </w:r>
+    </w:p>
+    <w:p>
+      <w:pPr>
+        <w:pStyle w:val="Heading1"/>
+      </w:pPr>
+      <w:r>
+        <w:t>12. Using the App — Step-by-Step Demo</w:t>
+      </w:r>
+    </w:p>
+    <w:p>
+      <w:r>
+        <w:t>Run python run.py --cli export-test-images first. Then:</w:t>
+      </w:r>
+    </w:p>
+    <w:p>
+      <w:pPr>
+        <w:pStyle w:val="ListBullet"/>
+      </w:pPr>
+      <w:r>
+        <w:t>Step 1: Start the app with python app.py (opens http://localhost:8000).</w:t>
+      </w:r>
+    </w:p>
+    <w:p>
+      <w:pPr>
+        <w:pStyle w:val="ListBullet"/>
+      </w:pPr>
+      <w:r>
+        <w:t>Step 2: Log in with admin / admin.</w:t>
+      </w:r>
+    </w:p>
+    <w:p>
+      <w:pPr>
+        <w:pStyle w:val="ListBullet"/>
+      </w:pPr>
+      <w:r>
+        <w:t>Step 3: Home shows the pipeline status and paper citation.</w:t>
+      </w:r>
+    </w:p>
+    <w:p>
+      <w:pPr>
+        <w:pStyle w:val="ListBullet"/>
+      </w:pPr>
+      <w:r>
+        <w:t>Step 4: Preview — pick a test image per class, press Submit, see prediction and Grad-CAM.</w:t>
+      </w:r>
+    </w:p>
+    <w:p>
+      <w:pPr>
+        <w:pStyle w:val="ListBullet"/>
+      </w:pPr>
+      <w:r>
+        <w:t>Step 5: Performance Analysis — accuracy tiles, confusion matrix, ROC curves.</w:t>
+      </w:r>
+    </w:p>
+    <w:p>
+      <w:pPr>
+        <w:pStyle w:val="ListBullet"/>
+      </w:pPr>
+      <w:r>
+        <w:t>Step 6: Chart — training loss and accuracy curves per backbone.</w:t>
+      </w:r>
+    </w:p>
+    <w:p>
+      <w:pPr>
+        <w:pStyle w:val="ListBullet"/>
+      </w:pPr>
+      <w:r>
+        <w:t>Step 7: About — architecture diagram and disclaimer.</w:t>
+      </w:r>
+    </w:p>
+    <w:p>
+      <w:pPr>
+        <w:pStyle w:val="ListBullet"/>
+      </w:pPr>
+      <w:r>
+        <w:t>Step 8: Logout returns to the login screen.</w:t>
+      </w:r>
+    </w:p>
+    <w:p>
+      <w:pPr>
+        <w:pStyle w:val="Heading1"/>
+      </w:pPr>
+      <w:r>
+        <w:t>13. Glossary</w:t>
       </w:r>
     </w:p>
     <w:p>
@@ -1876,7 +1966,7 @@
         <w:pStyle w:val="Heading1"/>
       </w:pPr>
       <w:r>
-        <w:t>12. References</w:t>
+        <w:t>14. References</w:t>
       </w:r>
     </w:p>
     <w:p>

</xml_diff>

<commit_message>
docs: add Divya Reddy as author and fix table column overlap
- Cover page now shows "Divya Reddy" as first author
- Widened first column of comparison, per-class and backbone
  tables so "[Malignant] early Pre-B" doesn't overlap column 2

Co-Authored-By: Claude Opus 4.6 <noreply@anthropic.com>
</commit_message>
<xml_diff>
--- a/docs/HOW_IT_WORKS.docx
+++ b/docs/HOW_IT_WORKS.docx
@@ -25,6 +25,17 @@
           <w:sz w:val="28"/>
         </w:rPr>
         <w:t>How It Works — A Non-Technical Guide</w:t>
+      </w:r>
+    </w:p>
+    <w:p>
+      <w:pPr>
+        <w:jc w:val="center"/>
+      </w:pPr>
+      <w:r>
+        <w:rPr>
+          <w:sz w:val="28"/>
+        </w:rPr>
+        <w:t>Divya Reddy</w:t>
       </w:r>
     </w:p>
     <w:p>

</xml_diff>

<commit_message>
docs(install): three-tier client setup
Replace the single quick-start with three explicit tiers, so a client can
see the system working before deciding whether they need a Kaggle account.

  Tier 1 - demo in 5 minutes, no Kaggle account. clone, pip install,
           --fetch-models, app.py. Runs on the 40 bundled demo images.
  Tier 2 - full test set (~6 GB), optional. Kaggle token, then
           --cli export-test-images.
  Tier 3 - retrain, optional. Colab GPU (~40 min) or CPU (~1.5 h).

Adds a "what is where" table covering models/, data/demo_images,
data/sample, results/, docs/ and docs/src, since data/sample (synthetic,
tests only) was easy to mistake for the demo set.

Applied to both the README and chapter 11 of HOW_IT_WORKS; the walkthrough
chapter no longer opens by telling the reader to run export-test-images,
which contradicted Tier 1. Regenerated the PDF (30 pp) and DOCX.

Co-Authored-By: Claude Opus 5 <noreply@anthropic.com>
</commit_message>
<xml_diff>
--- a/docs/HOW_IT_WORKS.docx
+++ b/docs/HOW_IT_WORKS.docx
@@ -1748,7 +1748,32 @@
     </w:p>
     <w:p>
       <w:r>
-        <w:t>Quick start: git clone, pip install -r requirements.txt, python run.py --fetch-models &lt;URL&gt;, python app.py. The --fetch-models command downloads ~105 MB of trained models and verifies SHA-256 checksums. Log in with admin / admin. See the PDF for full installation details and troubleshooting.</w:t>
+        <w:t>Setup comes in three tiers; Tier 1 is the only one most people need.</w:t>
+      </w:r>
+    </w:p>
+    <w:p>
+      <w:r>
+        <w:t>Tier 1 — Demo in 5 minutes (no Kaggle account): git clone, pip install -r requirements.txt, python run.py --fetch-models, python app.py. --fetch-models pulls ~105 MB of trained models from the release and verifies them against SHA-256 checksums. Log in with admin / admin. The Preview page is already stocked with the 40 bundled demo images, so predictions work immediately.</w:t>
+      </w:r>
+    </w:p>
+    <w:p>
+      <w:r>
+        <w:t>Tier 2 — Full test set (optional, ~6 GB): add a Kaggle API token on the Data page or in ~/.kaggle, press Download, then run python run.py --cli export-test-images.</w:t>
+      </w:r>
+    </w:p>
+    <w:p>
+      <w:r>
+        <w:t>Tier 3 — Retrain (optional, needs Tier 2): notebooks/train_colab.ipynb on a free Colab GPU (~40 min) or python run.py --cli all on CPU (~1.5 h); copy models/ back, then python run.py --cli evaluate.</w:t>
+      </w:r>
+    </w:p>
+    <w:p>
+      <w:r>
+        <w:t>What is where — models/: the trained networks, fetched from the release, not in git. data/demo_images: 40 real held-out test images (10 per class, CC BY 4.0, Aria et al.) that drive the Tier 1 demo. data/sample: 8 synthetic images for the automated tests only. results/: metrics and figures. docs/: the finished deliverables. docs/src: the sources they are generated from.</w:t>
+      </w:r>
+    </w:p>
+    <w:p>
+      <w:r>
+        <w:t>See the PDF for the full command listing and troubleshooting.</w:t>
       </w:r>
     </w:p>
     <w:p>
@@ -1761,7 +1786,7 @@
     </w:p>
     <w:p>
       <w:r>
-        <w:t>Run python run.py --cli export-test-images first. Then:</w:t>
+        <w:t>No preparation needed — after Tier 1 the Preview page already lists the 40 bundled demo images. (If you completed Tier 2, run python run.py --cli export-test-images to demo on the full held-out set instead.) Then:</w:t>
       </w:r>
     </w:p>
     <w:p>

</xml_diff>